<commit_message>
Ship the TOC as A4 PDF pages and PNGs for Google Docs.
Do not rely on Word tab leaders. Insert the three page images (or merge the PDF) so the dotted leaders stay intact.

Co-authored-by: omkeluskar <omkeluskar@users.noreply.github.com>
</commit_message>
<xml_diff>
--- a/cep-iot-bus-stop/chapters/Table_of_Contents_PAGES.docx
+++ b/cep-iot-bus-stop/chapters/Table_of_Contents_PAGES.docx
@@ -4,13 +4,13 @@
   <w:body>
     <w:p>
       <w:pPr>
-        <w:spacing w:before="0" w:after="0"/>
+        <w:spacing w:before="0" w:after="0" w:line="240" w:lineRule="auto"/>
         <w:jc w:val="center"/>
       </w:pPr>
       <w:r>
         <w:drawing>
           <wp:inline xmlns:a="http://schemas.openxmlformats.org/drawingml/2006/main" xmlns:pic="http://schemas.openxmlformats.org/drawingml/2006/picture">
-            <wp:extent cx="7040880" cy="9110805"/>
+            <wp:extent cx="7560000" cy="10692000"/>
             <wp:docPr id="1" name="Picture 1"/>
             <wp:cNvGraphicFramePr>
               <a:graphicFrameLocks noChangeAspect="1"/>
@@ -19,7 +19,7 @@
               <a:graphicData uri="http://schemas.openxmlformats.org/drawingml/2006/picture">
                 <pic:pic>
                   <pic:nvPicPr>
-                    <pic:cNvPr id="0" name="page_1.png"/>
+                    <pic:cNvPr id="0" name="TOC_page_1.png"/>
                     <pic:cNvPicPr/>
                   </pic:nvPicPr>
                   <pic:blipFill>
@@ -31,7 +31,7 @@
                   <pic:spPr>
                     <a:xfrm>
                       <a:off x="0" y="0"/>
-                      <a:ext cx="7040880" cy="9110805"/>
+                      <a:ext cx="7560000" cy="10692000"/>
                     </a:xfrm>
                     <a:prstGeom prst="rect"/>
                   </pic:spPr>
@@ -49,13 +49,13 @@
     </w:p>
     <w:p>
       <w:pPr>
-        <w:spacing w:before="0" w:after="0"/>
+        <w:spacing w:before="0" w:after="0" w:line="240" w:lineRule="auto"/>
         <w:jc w:val="center"/>
       </w:pPr>
       <w:r>
         <w:drawing>
           <wp:inline xmlns:a="http://schemas.openxmlformats.org/drawingml/2006/main" xmlns:pic="http://schemas.openxmlformats.org/drawingml/2006/picture">
-            <wp:extent cx="7040880" cy="9110805"/>
+            <wp:extent cx="7560000" cy="10692000"/>
             <wp:docPr id="2" name="Picture 2"/>
             <wp:cNvGraphicFramePr>
               <a:graphicFrameLocks noChangeAspect="1"/>
@@ -64,7 +64,7 @@
               <a:graphicData uri="http://schemas.openxmlformats.org/drawingml/2006/picture">
                 <pic:pic>
                   <pic:nvPicPr>
-                    <pic:cNvPr id="0" name="page_2.png"/>
+                    <pic:cNvPr id="0" name="TOC_page_2.png"/>
                     <pic:cNvPicPr/>
                   </pic:nvPicPr>
                   <pic:blipFill>
@@ -76,7 +76,7 @@
                   <pic:spPr>
                     <a:xfrm>
                       <a:off x="0" y="0"/>
-                      <a:ext cx="7040880" cy="9110805"/>
+                      <a:ext cx="7560000" cy="10692000"/>
                     </a:xfrm>
                     <a:prstGeom prst="rect"/>
                   </pic:spPr>
@@ -94,13 +94,13 @@
     </w:p>
     <w:p>
       <w:pPr>
-        <w:spacing w:before="0" w:after="0"/>
+        <w:spacing w:before="0" w:after="0" w:line="240" w:lineRule="auto"/>
         <w:jc w:val="center"/>
       </w:pPr>
       <w:r>
         <w:drawing>
           <wp:inline xmlns:a="http://schemas.openxmlformats.org/drawingml/2006/main" xmlns:pic="http://schemas.openxmlformats.org/drawingml/2006/picture">
-            <wp:extent cx="7040880" cy="9110805"/>
+            <wp:extent cx="7560000" cy="10692000"/>
             <wp:docPr id="3" name="Picture 3"/>
             <wp:cNvGraphicFramePr>
               <a:graphicFrameLocks noChangeAspect="1"/>
@@ -109,7 +109,7 @@
               <a:graphicData uri="http://schemas.openxmlformats.org/drawingml/2006/picture">
                 <pic:pic>
                   <pic:nvPicPr>
-                    <pic:cNvPr id="0" name="page_3.png"/>
+                    <pic:cNvPr id="0" name="TOC_page_3.png"/>
                     <pic:cNvPicPr/>
                   </pic:nvPicPr>
                   <pic:blipFill>
@@ -121,7 +121,7 @@
                   <pic:spPr>
                     <a:xfrm>
                       <a:off x="0" y="0"/>
-                      <a:ext cx="7040880" cy="9110805"/>
+                      <a:ext cx="7560000" cy="10692000"/>
                     </a:xfrm>
                     <a:prstGeom prst="rect"/>
                   </pic:spPr>
@@ -133,8 +133,8 @@
       </w:r>
     </w:p>
     <w:sectPr>
-      <w:pgSz w:w="12240" w:h="15840"/>
-      <w:pgMar w:top="576" w:right="576" w:bottom="576" w:left="576" w:header="720" w:footer="720" w:gutter="0"/>
+      <w:pgSz w:w="11906" w:h="16838"/>
+      <w:pgMar w:top="0" w:right="0" w:bottom="0" w:left="0" w:header="720" w:footer="720" w:gutter="0"/>
       <w:cols w:space="720"/>
       <w:docGrid w:linePitch="360"/>
     </w:sectPr>

</xml_diff>